<commit_message>
2o commit. 02-maio-2025 às 18:32. Pequena alteração na 2a seção do '1o Procedimento - Criando o Banco de Dados: forneci o nome do arquivo onde se encontra gravado o script T-SQL para a criação do banco de dados 'Loja_DB': 'SQL_Script_CREATE_DATABASE_Loja_DB_and_SCHEMA_dbo_with_tables_and_triggers_01.sql'.
</commit_message>
<xml_diff>
--- a/1o_Procedimento_Criando_o_Banco_de_Dados/Arquivos_de_texto_do_Apple_Pages_para_geracao_do_Relatorio_em_PDF/Relatorio_1o_Procedimento_Missao_Pratica.docx
+++ b/1o_Procedimento_Criando_o_Banco_de_Dados/Arquivos_de_texto_do_Apple_Pages_para_geracao_do_Relatorio_em_PDF/Relatorio_1o_Procedimento_Missao_Pratica.docx
@@ -1181,7 +1181,28 @@
           <w:rtl w:val="0"/>
           <w:lang w:val="pt-PT"/>
         </w:rPr>
-        <w:t xml:space="preserve">A seguir, apresenta-se o script </w:t>
+        <w:t xml:space="preserve">A seguir, </w:t>
+      </w:r>
+      <w:r>
+        <w:rPr>
+          <w:rtl w:val="0"/>
+          <w:lang w:val="en-US"/>
+        </w:rPr>
+        <w:t xml:space="preserve">é </w:t>
+      </w:r>
+      <w:r>
+        <w:rPr>
+          <w:rtl w:val="0"/>
+          <w:lang w:val="en-US"/>
+        </w:rPr>
+        <w:t>apresentado</w:t>
+      </w:r>
+      <w:r>
+        <w:rPr>
+          <w:rtl w:val="0"/>
+          <w:lang w:val="it-IT"/>
+        </w:rPr>
+        <w:t xml:space="preserve"> o script </w:t>
       </w:r>
       <w:r>
         <w:rPr>
@@ -1286,13 +1307,15 @@
           <w:rtl w:val="0"/>
           <w:lang w:val="en-US"/>
         </w:rPr>
-        <w:t>tica, no aplicativo Azure Data Studio conectado a um banco de dados SQL Server</w:t>
-      </w:r>
-      <w:r>
-        <w:rPr>
-          <w:rtl w:val="0"/>
-        </w:rPr>
-        <w:t>:</w:t>
+        <w:t xml:space="preserve">tica, no aplicativo Azure Data Studio conectado a um banco de dados SQL Server. Arquivo do script:  </w:t>
+      </w:r>
+      <w:r>
+        <w:rPr>
+          <w:rFonts w:ascii="Cambria Italic" w:hAnsi="Cambria Italic"/>
+          <w:rtl w:val="0"/>
+          <w:lang w:val="en-US"/>
+        </w:rPr>
+        <w:t>SQL_Script_CREATE_DATABASE_Loja_DB_and_SCHEMA_dbo_with_tables_and_triggers_01.sql</w:t>
       </w:r>
     </w:p>
     <w:tbl>

</xml_diff>